<commit_message>
Add the Англ2 glossary and mark its terms in the original
- ДолжиковДП_Англ2.md: glossary of 35 terms from the main text of
  Adaptive-RAG, each with the Russian equivalent used in the translation
  and a verbatim quote from the original.
- tools/mark_terms.py bolds every glossary term inside its quote in
  articles/article2_original.md (the methodology asks to mark terms in
  the article) and fails if a quote is not verbatim in the original;
  re-running it changes nothing.
- DOCX rebuilt; README, AGENTS.md and CLAUDE.md updated.

Co-Authored-By: Claude Opus 5.5 <noreply@anthropic.com>
Claude-Session: https://claude.ai/code/session_012rcQ2jGicmEaWTkWtfTEb2
</commit_message>
<xml_diff>
--- a/ДолжиковДП_Англ2.docx
+++ b/ДолжиковДП_Англ2.docx
@@ -11392,6 +11392,1521 @@
       </w:r>
     </w:p>
     <w:bookmarkEnd w:id="34"/>
+    <w:bookmarkStart w:id="35" w:name="слов-и-выражений-из-текста-статьи"/>
+    <w:p>
+      <w:pPr>
+        <w:pStyle w:val="Heading3"/>
+      </w:pPr>
+      <w:r>
+        <w:t xml:space="preserve">30 слов и выражений из текста статьи</w:t>
+      </w:r>
+    </w:p>
+    <w:p>
+      <w:pPr>
+        <w:numPr>
+          <w:ilvl w:val="0"/>
+          <w:numId w:val="1002"/>
+        </w:numPr>
+        <w:pStyle w:val="Compact"/>
+      </w:pPr>
+      <w:r>
+        <w:rPr>
+          <w:bCs/>
+          <w:b/>
+        </w:rPr>
+        <w:t xml:space="preserve">Retrieval-Augmented Large Language Models</w:t>
+      </w:r>
+      <w:r>
+        <w:t xml:space="preserve">: большие языковые модели (LLM), дополненные поиском (</w:t>
+      </w:r>
+      <w:r>
+        <w:rPr>
+          <w:iCs/>
+          <w:i/>
+        </w:rPr>
+        <w:t xml:space="preserve">“</w:t>
+      </w:r>
+      <w:r>
+        <w:rPr>
+          <w:iCs/>
+          <w:i/>
+        </w:rPr>
+        <w:t xml:space="preserve">Retrieval-Augmented Large Language Models (LLMs), which incorporate the non-parametric knowledge from external knowledge bases into LLMs</w:t>
+      </w:r>
+      <w:r>
+        <w:rPr>
+          <w:iCs/>
+          <w:i/>
+        </w:rPr>
+        <w:t xml:space="preserve">”</w:t>
+      </w:r>
+      <w:r>
+        <w:t xml:space="preserve">).</w:t>
+      </w:r>
+    </w:p>
+    <w:p>
+      <w:pPr>
+        <w:numPr>
+          <w:ilvl w:val="0"/>
+          <w:numId w:val="1002"/>
+        </w:numPr>
+        <w:pStyle w:val="Compact"/>
+      </w:pPr>
+      <w:r>
+        <w:rPr>
+          <w:bCs/>
+          <w:b/>
+        </w:rPr>
+        <w:t xml:space="preserve">Non-parametric knowledge</w:t>
+      </w:r>
+      <w:r>
+        <w:t xml:space="preserve">: непараметрические знания, т. е. знания, хранящиеся вне параметров модели (</w:t>
+      </w:r>
+      <w:r>
+        <w:rPr>
+          <w:iCs/>
+          <w:i/>
+        </w:rPr>
+        <w:t xml:space="preserve">“</w:t>
+      </w:r>
+      <w:r>
+        <w:rPr>
+          <w:iCs/>
+          <w:i/>
+        </w:rPr>
+        <w:t xml:space="preserve">which incorporate non-parametric knowledge into LLMs with additional retrieval modules</w:t>
+      </w:r>
+      <w:r>
+        <w:rPr>
+          <w:iCs/>
+          <w:i/>
+        </w:rPr>
+        <w:t xml:space="preserve">”</w:t>
+      </w:r>
+      <w:r>
+        <w:t xml:space="preserve">).</w:t>
+      </w:r>
+    </w:p>
+    <w:p>
+      <w:pPr>
+        <w:numPr>
+          <w:ilvl w:val="0"/>
+          <w:numId w:val="1002"/>
+        </w:numPr>
+        <w:pStyle w:val="Compact"/>
+      </w:pPr>
+      <w:r>
+        <w:rPr>
+          <w:bCs/>
+          <w:b/>
+        </w:rPr>
+        <w:t xml:space="preserve">Knowledge base</w:t>
+      </w:r>
+      <w:r>
+        <w:t xml:space="preserve">: база знаний (</w:t>
+      </w:r>
+      <w:r>
+        <w:rPr>
+          <w:iCs/>
+          <w:i/>
+        </w:rPr>
+        <w:t xml:space="preserve">“</w:t>
+      </w:r>
+      <w:r>
+        <w:rPr>
+          <w:iCs/>
+          <w:i/>
+        </w:rPr>
+        <w:t xml:space="preserve">these models access a knowledge base, which serves as an extensive repository of information</w:t>
+      </w:r>
+      <w:r>
+        <w:rPr>
+          <w:iCs/>
+          <w:i/>
+        </w:rPr>
+        <w:t xml:space="preserve">”</w:t>
+      </w:r>
+      <w:r>
+        <w:t xml:space="preserve">).</w:t>
+      </w:r>
+    </w:p>
+    <w:p>
+      <w:pPr>
+        <w:numPr>
+          <w:ilvl w:val="0"/>
+          <w:numId w:val="1002"/>
+        </w:numPr>
+        <w:pStyle w:val="Compact"/>
+      </w:pPr>
+      <w:r>
+        <w:rPr>
+          <w:bCs/>
+          <w:b/>
+        </w:rPr>
+        <w:t xml:space="preserve">Computational overhead</w:t>
+      </w:r>
+      <w:r>
+        <w:t xml:space="preserve">: вычислительные затраты, излишняя вычислительная нагрузка (</w:t>
+      </w:r>
+      <w:r>
+        <w:rPr>
+          <w:iCs/>
+          <w:i/>
+        </w:rPr>
+        <w:t xml:space="preserve">“</w:t>
+      </w:r>
+      <w:r>
+        <w:rPr>
+          <w:iCs/>
+          <w:i/>
+        </w:rPr>
+        <w:t xml:space="preserve">a multi-step QA approach could give rise to unnecessary computational overhead for simple queries</w:t>
+      </w:r>
+      <w:r>
+        <w:rPr>
+          <w:iCs/>
+          <w:i/>
+        </w:rPr>
+        <w:t xml:space="preserve">”</w:t>
+      </w:r>
+      <w:r>
+        <w:t xml:space="preserve">).</w:t>
+      </w:r>
+    </w:p>
+    <w:p>
+      <w:pPr>
+        <w:numPr>
+          <w:ilvl w:val="0"/>
+          <w:numId w:val="1002"/>
+        </w:numPr>
+        <w:pStyle w:val="Compact"/>
+      </w:pPr>
+      <w:r>
+        <w:rPr>
+          <w:bCs/>
+          <w:b/>
+        </w:rPr>
+        <w:t xml:space="preserve">Query complexity</w:t>
+      </w:r>
+      <w:r>
+        <w:t xml:space="preserve">: сложность запроса (</w:t>
+      </w:r>
+      <w:r>
+        <w:rPr>
+          <w:iCs/>
+          <w:i/>
+        </w:rPr>
+        <w:t xml:space="preserve">“</w:t>
+      </w:r>
+      <w:r>
+        <w:rPr>
+          <w:iCs/>
+          <w:i/>
+        </w:rPr>
+        <w:t xml:space="preserve">from the simplest to the most sophisticated ones based on the query complexity</w:t>
+      </w:r>
+      <w:r>
+        <w:rPr>
+          <w:iCs/>
+          <w:i/>
+        </w:rPr>
+        <w:t xml:space="preserve">”</w:t>
+      </w:r>
+      <w:r>
+        <w:t xml:space="preserve">).</w:t>
+      </w:r>
+    </w:p>
+    <w:p>
+      <w:pPr>
+        <w:numPr>
+          <w:ilvl w:val="0"/>
+          <w:numId w:val="1002"/>
+        </w:numPr>
+        <w:pStyle w:val="Compact"/>
+      </w:pPr>
+      <w:r>
+        <w:rPr>
+          <w:bCs/>
+          <w:b/>
+        </w:rPr>
+        <w:t xml:space="preserve">Inductive biases</w:t>
+      </w:r>
+      <w:r>
+        <w:t xml:space="preserve">: индуктивные смещения (</w:t>
+      </w:r>
+      <w:r>
+        <w:rPr>
+          <w:iCs/>
+          <w:i/>
+        </w:rPr>
+        <w:t xml:space="preserve">“</w:t>
+      </w:r>
+      <w:r>
+        <w:rPr>
+          <w:iCs/>
+          <w:i/>
+        </w:rPr>
+        <w:t xml:space="preserve">obtained from actual predicted outcomes of models and inherent inductive biases in datasets</w:t>
+      </w:r>
+      <w:r>
+        <w:rPr>
+          <w:iCs/>
+          <w:i/>
+        </w:rPr>
+        <w:t xml:space="preserve">”</w:t>
+      </w:r>
+      <w:r>
+        <w:t xml:space="preserve">).</w:t>
+      </w:r>
+    </w:p>
+    <w:p>
+      <w:pPr>
+        <w:numPr>
+          <w:ilvl w:val="0"/>
+          <w:numId w:val="1002"/>
+        </w:numPr>
+        <w:pStyle w:val="Compact"/>
+      </w:pPr>
+      <w:r>
+        <w:rPr>
+          <w:bCs/>
+          <w:b/>
+        </w:rPr>
+        <w:t xml:space="preserve">Open-domain QA</w:t>
+      </w:r>
+      <w:r>
+        <w:t xml:space="preserve">: ответы на вопросы в открытой предметной области (</w:t>
+      </w:r>
+      <w:r>
+        <w:rPr>
+          <w:iCs/>
+          <w:i/>
+        </w:rPr>
+        <w:t xml:space="preserve">“</w:t>
+      </w:r>
+      <w:r>
+        <w:rPr>
+          <w:iCs/>
+          <w:i/>
+        </w:rPr>
+        <w:t xml:space="preserve">We validate our model on a set of open-domain QA datasets</w:t>
+      </w:r>
+      <w:r>
+        <w:rPr>
+          <w:iCs/>
+          <w:i/>
+        </w:rPr>
+        <w:t xml:space="preserve">”</w:t>
+      </w:r>
+      <w:r>
+        <w:t xml:space="preserve">).</w:t>
+      </w:r>
+    </w:p>
+    <w:p>
+      <w:pPr>
+        <w:numPr>
+          <w:ilvl w:val="0"/>
+          <w:numId w:val="1002"/>
+        </w:numPr>
+        <w:pStyle w:val="Compact"/>
+      </w:pPr>
+      <w:r>
+        <w:rPr>
+          <w:bCs/>
+          <w:b/>
+        </w:rPr>
+        <w:t xml:space="preserve">Parametric memory</w:t>
+      </w:r>
+      <w:r>
+        <w:t xml:space="preserve">: параметрическая память, т. е. знания, хранящиеся в параметрах модели (</w:t>
+      </w:r>
+      <w:r>
+        <w:rPr>
+          <w:iCs/>
+          <w:i/>
+        </w:rPr>
+        <w:t xml:space="preserve">“</w:t>
+      </w:r>
+      <w:r>
+        <w:rPr>
+          <w:iCs/>
+          <w:i/>
+        </w:rPr>
+        <w:t xml:space="preserve">since their knowledge solely relies on their parametric memory</w:t>
+      </w:r>
+      <w:r>
+        <w:rPr>
+          <w:iCs/>
+          <w:i/>
+        </w:rPr>
+        <w:t xml:space="preserve">”</w:t>
+      </w:r>
+      <w:r>
+        <w:t xml:space="preserve">).</w:t>
+      </w:r>
+    </w:p>
+    <w:p>
+      <w:pPr>
+        <w:numPr>
+          <w:ilvl w:val="0"/>
+          <w:numId w:val="1002"/>
+        </w:numPr>
+        <w:pStyle w:val="Compact"/>
+      </w:pPr>
+      <w:r>
+        <w:rPr>
+          <w:bCs/>
+          <w:b/>
+        </w:rPr>
+        <w:t xml:space="preserve">Single-hop queries</w:t>
+      </w:r>
+      <w:r>
+        <w:t xml:space="preserve">: однопереходные запросы, ответ на которые содержится в одном документе (</w:t>
+      </w:r>
+      <w:r>
+        <w:rPr>
+          <w:iCs/>
+          <w:i/>
+        </w:rPr>
+        <w:t xml:space="preserve">“</w:t>
+      </w:r>
+      <w:r>
+        <w:rPr>
+          <w:iCs/>
+          <w:i/>
+        </w:rPr>
+        <w:t xml:space="preserve">Early work on retrieval-augmented LLMs focuses primarily on single-hop queries</w:t>
+      </w:r>
+      <w:r>
+        <w:rPr>
+          <w:iCs/>
+          <w:i/>
+        </w:rPr>
+        <w:t xml:space="preserve">”</w:t>
+      </w:r>
+      <w:r>
+        <w:t xml:space="preserve">).</w:t>
+      </w:r>
+    </w:p>
+    <w:p>
+      <w:pPr>
+        <w:numPr>
+          <w:ilvl w:val="0"/>
+          <w:numId w:val="1002"/>
+        </w:numPr>
+        <w:pStyle w:val="Compact"/>
+      </w:pPr>
+      <w:r>
+        <w:rPr>
+          <w:bCs/>
+          <w:b/>
+        </w:rPr>
+        <w:t xml:space="preserve">Multi-step reasoning</w:t>
+      </w:r>
+      <w:r>
+        <w:t xml:space="preserve">: многошаговые рассуждения (</w:t>
+      </w:r>
+      <w:r>
+        <w:rPr>
+          <w:iCs/>
+          <w:i/>
+        </w:rPr>
+        <w:t xml:space="preserve">“</w:t>
+      </w:r>
+      <w:r>
+        <w:rPr>
+          <w:iCs/>
+          <w:i/>
+        </w:rPr>
+        <w:t xml:space="preserve">it may not be sufficient for complex queries that require multi-step reasoning</w:t>
+      </w:r>
+      <w:r>
+        <w:rPr>
+          <w:iCs/>
+          <w:i/>
+        </w:rPr>
+        <w:t xml:space="preserve">”</w:t>
+      </w:r>
+      <w:r>
+        <w:t xml:space="preserve">).</w:t>
+      </w:r>
+    </w:p>
+    <w:p>
+      <w:pPr>
+        <w:numPr>
+          <w:ilvl w:val="0"/>
+          <w:numId w:val="1002"/>
+        </w:numPr>
+        <w:pStyle w:val="Compact"/>
+      </w:pPr>
+      <w:r>
+        <w:rPr>
+          <w:bCs/>
+          <w:b/>
+        </w:rPr>
+        <w:t xml:space="preserve">Benchmark datasets</w:t>
+      </w:r>
+      <w:r>
+        <w:t xml:space="preserve">: эталонные наборы данных (бенчмарки) (</w:t>
+      </w:r>
+      <w:r>
+        <w:rPr>
+          <w:iCs/>
+          <w:i/>
+        </w:rPr>
+        <w:t xml:space="preserve">“</w:t>
+      </w:r>
+      <w:r>
+        <w:rPr>
+          <w:iCs/>
+          <w:i/>
+        </w:rPr>
+        <w:t xml:space="preserve">the benchmark datasets may already have meaningful inductive biases</w:t>
+      </w:r>
+      <w:r>
+        <w:rPr>
+          <w:iCs/>
+          <w:i/>
+        </w:rPr>
+        <w:t xml:space="preserve">”</w:t>
+      </w:r>
+      <w:r>
+        <w:t xml:space="preserve">).</w:t>
+      </w:r>
+    </w:p>
+    <w:p>
+      <w:pPr>
+        <w:numPr>
+          <w:ilvl w:val="0"/>
+          <w:numId w:val="1002"/>
+        </w:numPr>
+        <w:pStyle w:val="Compact"/>
+      </w:pPr>
+      <w:r>
+        <w:rPr>
+          <w:bCs/>
+          <w:b/>
+        </w:rPr>
+        <w:t xml:space="preserve">One-size-fits-all approaches</w:t>
+      </w:r>
+      <w:r>
+        <w:t xml:space="preserve">: универсальные подходы, построенные по принципу «одно решение для всех» (</w:t>
+      </w:r>
+      <w:r>
+        <w:rPr>
+          <w:iCs/>
+          <w:i/>
+        </w:rPr>
+        <w:t xml:space="preserve">“</w:t>
+      </w:r>
+      <w:r>
+        <w:rPr>
+          <w:iCs/>
+          <w:i/>
+        </w:rPr>
+        <w:t xml:space="preserve">we argue that previous one-size-fits-all approaches might be inadequate to cover all of them</w:t>
+      </w:r>
+      <w:r>
+        <w:rPr>
+          <w:iCs/>
+          <w:i/>
+        </w:rPr>
+        <w:t xml:space="preserve">”</w:t>
+      </w:r>
+      <w:r>
+        <w:t xml:space="preserve">).</w:t>
+      </w:r>
+    </w:p>
+    <w:p>
+      <w:pPr>
+        <w:numPr>
+          <w:ilvl w:val="0"/>
+          <w:numId w:val="1002"/>
+        </w:numPr>
+        <w:pStyle w:val="Compact"/>
+      </w:pPr>
+      <w:r>
+        <w:rPr>
+          <w:bCs/>
+          <w:b/>
+        </w:rPr>
+        <w:t xml:space="preserve">Human labeling</w:t>
+      </w:r>
+      <w:r>
+        <w:t xml:space="preserve">: ручная разметка (</w:t>
+      </w:r>
+      <w:r>
+        <w:rPr>
+          <w:iCs/>
+          <w:i/>
+        </w:rPr>
+        <w:t xml:space="preserve">“</w:t>
+      </w:r>
+      <w:r>
+        <w:rPr>
+          <w:iCs/>
+          <w:i/>
+        </w:rPr>
+        <w:t xml:space="preserve">we automatically collect its training datasets without human labeling</w:t>
+      </w:r>
+      <w:r>
+        <w:rPr>
+          <w:iCs/>
+          <w:i/>
+        </w:rPr>
+        <w:t xml:space="preserve">”</w:t>
+      </w:r>
+      <w:r>
+        <w:t xml:space="preserve">).</w:t>
+      </w:r>
+    </w:p>
+    <w:p>
+      <w:pPr>
+        <w:numPr>
+          <w:ilvl w:val="0"/>
+          <w:numId w:val="1002"/>
+        </w:numPr>
+        <w:pStyle w:val="Compact"/>
+      </w:pPr>
+      <w:r>
+        <w:rPr>
+          <w:bCs/>
+          <w:b/>
+        </w:rPr>
+        <w:t xml:space="preserve">Retriever</w:t>
+      </w:r>
+      <w:r>
+        <w:t xml:space="preserve">: ретривер, поисковый модуль (</w:t>
+      </w:r>
+      <w:r>
+        <w:rPr>
+          <w:iCs/>
+          <w:i/>
+        </w:rPr>
+        <w:t xml:space="preserve">“</w:t>
+      </w:r>
+      <w:r>
+        <w:rPr>
+          <w:iCs/>
+          <w:i/>
+        </w:rPr>
+        <w:t xml:space="preserve">generally involves two modules: a retriever</w:t>
+      </w:r>
+      <w:r>
+        <w:rPr>
+          <w:iCs/>
+          <w:i/>
+        </w:rPr>
+        <w:t xml:space="preserve">”</w:t>
+      </w:r>
+      <w:r>
+        <w:t xml:space="preserve">).</w:t>
+      </w:r>
+    </w:p>
+    <w:p>
+      <w:pPr>
+        <w:numPr>
+          <w:ilvl w:val="0"/>
+          <w:numId w:val="1002"/>
+        </w:numPr>
+        <w:pStyle w:val="Compact"/>
+      </w:pPr>
+      <w:r>
+        <w:rPr>
+          <w:bCs/>
+          <w:b/>
+        </w:rPr>
+        <w:t xml:space="preserve">Reader</w:t>
+      </w:r>
+      <w:r>
+        <w:t xml:space="preserve">: модуль чтения (</w:t>
+      </w:r>
+      <w:r>
+        <w:rPr>
+          <w:iCs/>
+          <w:i/>
+        </w:rPr>
+        <w:t xml:space="preserve">“</w:t>
+      </w:r>
+      <w:r>
+        <w:rPr>
+          <w:iCs/>
+          <w:i/>
+        </w:rPr>
+        <w:t xml:space="preserve">through strengthened reasoning abilities of the reader</w:t>
+      </w:r>
+      <w:r>
+        <w:rPr>
+          <w:iCs/>
+          <w:i/>
+        </w:rPr>
+        <w:t xml:space="preserve">”</w:t>
+      </w:r>
+      <w:r>
+        <w:t xml:space="preserve">).</w:t>
+      </w:r>
+    </w:p>
+    <w:p>
+      <w:pPr>
+        <w:numPr>
+          <w:ilvl w:val="0"/>
+          <w:numId w:val="1002"/>
+        </w:numPr>
+        <w:pStyle w:val="Compact"/>
+      </w:pPr>
+      <w:r>
+        <w:rPr>
+          <w:bCs/>
+          <w:b/>
+        </w:rPr>
+        <w:t xml:space="preserve">Hallucination problem</w:t>
+      </w:r>
+      <w:r>
+        <w:t xml:space="preserve">: проблема галлюцинаций языковых моделей (</w:t>
+      </w:r>
+      <w:r>
+        <w:rPr>
+          <w:iCs/>
+          <w:i/>
+        </w:rPr>
+        <w:t xml:space="preserve">“</w:t>
+      </w:r>
+      <w:r>
+        <w:rPr>
+          <w:iCs/>
+          <w:i/>
+        </w:rPr>
+        <w:t xml:space="preserve">by mitigating the hallucination problem from LLMs</w:t>
+      </w:r>
+      <w:r>
+        <w:rPr>
+          <w:iCs/>
+          <w:i/>
+        </w:rPr>
+        <w:t xml:space="preserve">”</w:t>
+      </w:r>
+      <w:r>
+        <w:t xml:space="preserve">).</w:t>
+      </w:r>
+    </w:p>
+    <w:p>
+      <w:pPr>
+        <w:numPr>
+          <w:ilvl w:val="0"/>
+          <w:numId w:val="1002"/>
+        </w:numPr>
+        <w:pStyle w:val="Compact"/>
+      </w:pPr>
+      <w:r>
+        <w:rPr>
+          <w:bCs/>
+          <w:b/>
+        </w:rPr>
+        <w:t xml:space="preserve">Multi-hop QA</w:t>
+      </w:r>
+      <w:r>
+        <w:t xml:space="preserve">: многопереходные ответы на вопросы, требующие сведений из нескольких документов (</w:t>
+      </w:r>
+      <w:r>
+        <w:rPr>
+          <w:iCs/>
+          <w:i/>
+        </w:rPr>
+        <w:t xml:space="preserve">“</w:t>
+      </w:r>
+      <w:r>
+        <w:rPr>
+          <w:iCs/>
+          <w:i/>
+        </w:rPr>
+        <w:t xml:space="preserve">Multi-hop QA is an extension of conventional Open-domain QA</w:t>
+      </w:r>
+      <w:r>
+        <w:rPr>
+          <w:iCs/>
+          <w:i/>
+        </w:rPr>
+        <w:t xml:space="preserve">”</w:t>
+      </w:r>
+      <w:r>
+        <w:t xml:space="preserve">).</w:t>
+      </w:r>
+    </w:p>
+    <w:p>
+      <w:pPr>
+        <w:numPr>
+          <w:ilvl w:val="0"/>
+          <w:numId w:val="1002"/>
+        </w:numPr>
+        <w:pStyle w:val="Compact"/>
+      </w:pPr>
+      <w:r>
+        <w:rPr>
+          <w:bCs/>
+          <w:b/>
+        </w:rPr>
+        <w:t xml:space="preserve">Sub-queries</w:t>
+      </w:r>
+      <w:r>
+        <w:t xml:space="preserve">: подзапросы (</w:t>
+      </w:r>
+      <w:r>
+        <w:rPr>
+          <w:iCs/>
+          <w:i/>
+        </w:rPr>
+        <w:t xml:space="preserve">“</w:t>
+      </w:r>
+      <w:r>
+        <w:rPr>
+          <w:iCs/>
+          <w:i/>
+        </w:rPr>
+        <w:t xml:space="preserve">repeatedly access the LLMs and retriever to solve these sub-queries</w:t>
+      </w:r>
+      <w:r>
+        <w:rPr>
+          <w:iCs/>
+          <w:i/>
+        </w:rPr>
+        <w:t xml:space="preserve">”</w:t>
+      </w:r>
+      <w:r>
+        <w:t xml:space="preserve">).</w:t>
+      </w:r>
+    </w:p>
+    <w:p>
+      <w:pPr>
+        <w:numPr>
+          <w:ilvl w:val="0"/>
+          <w:numId w:val="1002"/>
+        </w:numPr>
+        <w:pStyle w:val="Compact"/>
+      </w:pPr>
+      <w:r>
+        <w:rPr>
+          <w:bCs/>
+          <w:b/>
+        </w:rPr>
+        <w:t xml:space="preserve">Chain-of-Thought reasoning</w:t>
+      </w:r>
+      <w:r>
+        <w:t xml:space="preserve">: рассуждения по цепочке мыслей (</w:t>
+      </w:r>
+      <w:r>
+        <w:rPr>
+          <w:iCs/>
+          <w:i/>
+        </w:rPr>
+        <w:t xml:space="preserve">“</w:t>
+      </w:r>
+      <w:r>
+        <w:rPr>
+          <w:iCs/>
+          <w:i/>
+        </w:rPr>
+        <w:t xml:space="preserve">explored the interleaving of Chain-of-Thought reasoning</w:t>
+      </w:r>
+      <w:r>
+        <w:rPr>
+          <w:iCs/>
+          <w:i/>
+        </w:rPr>
+        <w:t xml:space="preserve">”</w:t>
+      </w:r>
+      <w:r>
+        <w:t xml:space="preserve">).</w:t>
+      </w:r>
+    </w:p>
+    <w:p>
+      <w:pPr>
+        <w:numPr>
+          <w:ilvl w:val="0"/>
+          <w:numId w:val="1002"/>
+        </w:numPr>
+        <w:pStyle w:val="Compact"/>
+      </w:pPr>
+      <w:r>
+        <w:rPr>
+          <w:bCs/>
+          <w:b/>
+        </w:rPr>
+        <w:t xml:space="preserve">Adaptive retrieval</w:t>
+      </w:r>
+      <w:r>
+        <w:t xml:space="preserve">: адаптивный поиск (</w:t>
+      </w:r>
+      <w:r>
+        <w:rPr>
+          <w:iCs/>
+          <w:i/>
+        </w:rPr>
+        <w:t xml:space="preserve">“</w:t>
+      </w:r>
+      <w:r>
+        <w:rPr>
+          <w:iCs/>
+          <w:i/>
+        </w:rPr>
+        <w:t xml:space="preserve">the adaptive retrieval strategy aims to dynamically decide whether to retrieve documents or not</w:t>
+      </w:r>
+      <w:r>
+        <w:rPr>
+          <w:iCs/>
+          <w:i/>
+        </w:rPr>
+        <w:t xml:space="preserve">”</w:t>
+      </w:r>
+      <w:r>
+        <w:t xml:space="preserve">).</w:t>
+      </w:r>
+    </w:p>
+    <w:p>
+      <w:pPr>
+        <w:numPr>
+          <w:ilvl w:val="0"/>
+          <w:numId w:val="1002"/>
+        </w:numPr>
+        <w:pStyle w:val="Compact"/>
+      </w:pPr>
+      <w:r>
+        <w:rPr>
+          <w:bCs/>
+          <w:b/>
+        </w:rPr>
+        <w:t xml:space="preserve">Reranking</w:t>
+      </w:r>
+      <w:r>
+        <w:t xml:space="preserve">: переранжирование (</w:t>
+      </w:r>
+      <w:r>
+        <w:rPr>
+          <w:iCs/>
+          <w:i/>
+        </w:rPr>
+        <w:t xml:space="preserve">“</w:t>
+      </w:r>
+      <w:r>
+        <w:rPr>
+          <w:iCs/>
+          <w:i/>
+        </w:rPr>
+        <w:t xml:space="preserve">a fixed set of operations (retrieving, reading, and reranking)</w:t>
+      </w:r>
+      <w:r>
+        <w:rPr>
+          <w:iCs/>
+          <w:i/>
+        </w:rPr>
+        <w:t xml:space="preserve">”</w:t>
+      </w:r>
+      <w:r>
+        <w:t xml:space="preserve">).</w:t>
+      </w:r>
+    </w:p>
+    <w:p>
+      <w:pPr>
+        <w:numPr>
+          <w:ilvl w:val="0"/>
+          <w:numId w:val="1002"/>
+        </w:numPr>
+        <w:pStyle w:val="Compact"/>
+      </w:pPr>
+      <w:r>
+        <w:rPr>
+          <w:bCs/>
+          <w:b/>
+        </w:rPr>
+        <w:t xml:space="preserve">Off-the-shelf LLMs</w:t>
+      </w:r>
+      <w:r>
+        <w:t xml:space="preserve">: готовые LLM, используемые без дообучения (</w:t>
+      </w:r>
+      <w:r>
+        <w:rPr>
+          <w:iCs/>
+          <w:i/>
+        </w:rPr>
+        <w:t xml:space="preserve">“</w:t>
+      </w:r>
+      <w:r>
+        <w:rPr>
+          <w:iCs/>
+          <w:i/>
+        </w:rPr>
+        <w:t xml:space="preserve">adapts the operational behavior of any off-the-shelf LLMs accordingly</w:t>
+      </w:r>
+      <w:r>
+        <w:rPr>
+          <w:iCs/>
+          <w:i/>
+        </w:rPr>
+        <w:t xml:space="preserve">”</w:t>
+      </w:r>
+      <w:r>
+        <w:t xml:space="preserve">).</w:t>
+      </w:r>
+    </w:p>
+    <w:p>
+      <w:pPr>
+        <w:numPr>
+          <w:ilvl w:val="0"/>
+          <w:numId w:val="1002"/>
+        </w:numPr>
+        <w:pStyle w:val="Compact"/>
+      </w:pPr>
+      <w:r>
+        <w:rPr>
+          <w:bCs/>
+          <w:b/>
+        </w:rPr>
+        <w:t xml:space="preserve">Retrieval model</w:t>
+      </w:r>
+      <w:r>
+        <w:t xml:space="preserve">: поисковая модель (</w:t>
+      </w:r>
+      <w:r>
+        <w:rPr>
+          <w:iCs/>
+          <w:i/>
+        </w:rPr>
+        <w:t xml:space="preserve">“</w:t>
+      </w:r>
+      <w:r>
+        <w:rPr>
+          <w:iCs/>
+          <w:i/>
+        </w:rPr>
+        <w:t xml:space="preserve">a specific retrieval model is necessary</w:t>
+      </w:r>
+      <w:r>
+        <w:rPr>
+          <w:iCs/>
+          <w:i/>
+        </w:rPr>
+        <w:t xml:space="preserve">”</w:t>
+      </w:r>
+      <w:r>
+        <w:t xml:space="preserve">).</w:t>
+      </w:r>
+    </w:p>
+    <w:p>
+      <w:pPr>
+        <w:numPr>
+          <w:ilvl w:val="0"/>
+          <w:numId w:val="1002"/>
+        </w:numPr>
+        <w:pStyle w:val="Compact"/>
+      </w:pPr>
+      <w:r>
+        <w:rPr>
+          <w:bCs/>
+          <w:b/>
+        </w:rPr>
+        <w:t xml:space="preserve">Resource-intensive</w:t>
+      </w:r>
+      <w:r>
+        <w:t xml:space="preserve">: ресурсоёмкий (</w:t>
+      </w:r>
+      <w:r>
+        <w:rPr>
+          <w:iCs/>
+          <w:i/>
+        </w:rPr>
+        <w:t xml:space="preserve">“</w:t>
+      </w:r>
+      <w:r>
+        <w:rPr>
+          <w:iCs/>
+          <w:i/>
+        </w:rPr>
+        <w:t xml:space="preserve">this multi-step approach can be resource-intensive</w:t>
+      </w:r>
+      <w:r>
+        <w:rPr>
+          <w:iCs/>
+          <w:i/>
+        </w:rPr>
+        <w:t xml:space="preserve">”</w:t>
+      </w:r>
+      <w:r>
+        <w:t xml:space="preserve">).</w:t>
+      </w:r>
+    </w:p>
+    <w:p>
+      <w:pPr>
+        <w:numPr>
+          <w:ilvl w:val="0"/>
+          <w:numId w:val="1002"/>
+        </w:numPr>
+        <w:pStyle w:val="Compact"/>
+      </w:pPr>
+      <w:r>
+        <w:rPr>
+          <w:bCs/>
+          <w:b/>
+        </w:rPr>
+        <w:t xml:space="preserve">Robust middle ground</w:t>
+      </w:r>
+      <w:r>
+        <w:t xml:space="preserve">: надёжное промежуточное (компромиссное) решение (</w:t>
+      </w:r>
+      <w:r>
+        <w:rPr>
+          <w:iCs/>
+          <w:i/>
+        </w:rPr>
+        <w:t xml:space="preserve">“</w:t>
+      </w:r>
+      <w:r>
+        <w:rPr>
+          <w:iCs/>
+          <w:i/>
+        </w:rPr>
+        <w:t xml:space="preserve">this framework can offer a robust middle ground with a range of solutions</w:t>
+      </w:r>
+      <w:r>
+        <w:rPr>
+          <w:iCs/>
+          <w:i/>
+        </w:rPr>
+        <w:t xml:space="preserve">”</w:t>
+      </w:r>
+      <w:r>
+        <w:t xml:space="preserve">).</w:t>
+      </w:r>
+    </w:p>
+    <w:p>
+      <w:pPr>
+        <w:numPr>
+          <w:ilvl w:val="0"/>
+          <w:numId w:val="1002"/>
+        </w:numPr>
+        <w:pStyle w:val="Compact"/>
+      </w:pPr>
+      <w:r>
+        <w:rPr>
+          <w:bCs/>
+          <w:b/>
+        </w:rPr>
+        <w:t xml:space="preserve">Complexity classifier</w:t>
+      </w:r>
+      <w:r>
+        <w:t xml:space="preserve">: классификатор сложности (</w:t>
+      </w:r>
+      <w:r>
+        <w:rPr>
+          <w:iCs/>
+          <w:i/>
+        </w:rPr>
+        <w:t xml:space="preserve">“</w:t>
+      </w:r>
+      <w:r>
+        <w:rPr>
+          <w:iCs/>
+          <w:i/>
+        </w:rPr>
+        <w:t xml:space="preserve">we propose to model a complexity classifier</w:t>
+      </w:r>
+      <w:r>
+        <w:rPr>
+          <w:iCs/>
+          <w:i/>
+        </w:rPr>
+        <w:t xml:space="preserve">”</w:t>
+      </w:r>
+      <w:r>
+        <w:t xml:space="preserve">).</w:t>
+      </w:r>
+    </w:p>
+    <w:p>
+      <w:pPr>
+        <w:numPr>
+          <w:ilvl w:val="0"/>
+          <w:numId w:val="1002"/>
+        </w:numPr>
+        <w:pStyle w:val="Compact"/>
+      </w:pPr>
+      <w:r>
+        <w:rPr>
+          <w:bCs/>
+          <w:b/>
+        </w:rPr>
+        <w:t xml:space="preserve">Cross-entropy loss</w:t>
+      </w:r>
+      <w:r>
+        <w:t xml:space="preserve">: функция потерь перекрёстной энтропии (</w:t>
+      </w:r>
+      <w:r>
+        <w:rPr>
+          <w:iCs/>
+          <w:i/>
+        </w:rPr>
+        <w:t xml:space="preserve">“</w:t>
+      </w:r>
+      <w:r>
+        <w:rPr>
+          <w:iCs/>
+          <w:i/>
+        </w:rPr>
+        <w:t xml:space="preserve">by using a cross-entropy loss</w:t>
+      </w:r>
+      <w:r>
+        <w:rPr>
+          <w:iCs/>
+          <w:i/>
+        </w:rPr>
+        <w:t xml:space="preserve">”</w:t>
+      </w:r>
+      <w:r>
+        <w:t xml:space="preserve">).</w:t>
+      </w:r>
+    </w:p>
+    <w:p>
+      <w:pPr>
+        <w:numPr>
+          <w:ilvl w:val="0"/>
+          <w:numId w:val="1002"/>
+        </w:numPr>
+        <w:pStyle w:val="Compact"/>
+      </w:pPr>
+      <w:r>
+        <w:rPr>
+          <w:bCs/>
+          <w:b/>
+        </w:rPr>
+        <w:t xml:space="preserve">Term-based sparse retrieval model</w:t>
+      </w:r>
+      <w:r>
+        <w:t xml:space="preserve">: разреженная поисковая модель на основе терминов (</w:t>
+      </w:r>
+      <w:r>
+        <w:rPr>
+          <w:iCs/>
+          <w:i/>
+        </w:rPr>
+        <w:t xml:space="preserve">“</w:t>
+      </w:r>
+      <w:r>
+        <w:rPr>
+          <w:iCs/>
+          <w:i/>
+        </w:rPr>
+        <w:t xml:space="preserve">a term-based sparse retrieval model known as BM25</w:t>
+      </w:r>
+      <w:r>
+        <w:rPr>
+          <w:iCs/>
+          <w:i/>
+        </w:rPr>
+        <w:t xml:space="preserve">”</w:t>
+      </w:r>
+      <w:r>
+        <w:t xml:space="preserve">).</w:t>
+      </w:r>
+    </w:p>
+    <w:p>
+      <w:pPr>
+        <w:numPr>
+          <w:ilvl w:val="0"/>
+          <w:numId w:val="1002"/>
+        </w:numPr>
+        <w:pStyle w:val="Compact"/>
+      </w:pPr>
+      <w:r>
+        <w:rPr>
+          <w:bCs/>
+          <w:b/>
+        </w:rPr>
+        <w:t xml:space="preserve">Learning rate</w:t>
+      </w:r>
+      <w:r>
+        <w:t xml:space="preserve">: скорость обучения (</w:t>
+      </w:r>
+      <w:r>
+        <w:rPr>
+          <w:iCs/>
+          <w:i/>
+        </w:rPr>
+        <w:t xml:space="preserve">“</w:t>
+      </w:r>
+      <w:r>
+        <w:rPr>
+          <w:iCs/>
+          <w:i/>
+        </w:rPr>
+        <w:t xml:space="preserve">with the learning rate of 3e-5</w:t>
+      </w:r>
+      <w:r>
+        <w:rPr>
+          <w:iCs/>
+          <w:i/>
+        </w:rPr>
+        <w:t xml:space="preserve">”</w:t>
+      </w:r>
+      <w:r>
+        <w:t xml:space="preserve">).</w:t>
+      </w:r>
+    </w:p>
+    <w:p>
+      <w:pPr>
+        <w:numPr>
+          <w:ilvl w:val="0"/>
+          <w:numId w:val="1002"/>
+        </w:numPr>
+        <w:pStyle w:val="Compact"/>
+      </w:pPr>
+      <w:r>
+        <w:rPr>
+          <w:bCs/>
+          <w:b/>
+        </w:rPr>
+        <w:t xml:space="preserve">Ground truth</w:t>
+      </w:r>
+      <w:r>
+        <w:t xml:space="preserve">: эталонный (истинный) ответ (</w:t>
+      </w:r>
+      <w:r>
+        <w:rPr>
+          <w:iCs/>
+          <w:i/>
+        </w:rPr>
+        <w:t xml:space="preserve">“</w:t>
+      </w:r>
+      <w:r>
+        <w:rPr>
+          <w:iCs/>
+          <w:i/>
+        </w:rPr>
+        <w:t xml:space="preserve">the number of overlapping words between the predicted answer and the ground truth</w:t>
+      </w:r>
+      <w:r>
+        <w:rPr>
+          <w:iCs/>
+          <w:i/>
+        </w:rPr>
+        <w:t xml:space="preserve">”</w:t>
+      </w:r>
+      <w:r>
+        <w:t xml:space="preserve">).</w:t>
+      </w:r>
+    </w:p>
+    <w:p>
+      <w:pPr>
+        <w:numPr>
+          <w:ilvl w:val="0"/>
+          <w:numId w:val="1002"/>
+        </w:numPr>
+        <w:pStyle w:val="Compact"/>
+      </w:pPr>
+      <w:r>
+        <w:rPr>
+          <w:bCs/>
+          <w:b/>
+        </w:rPr>
+        <w:t xml:space="preserve">Trade-offs</w:t>
+      </w:r>
+      <w:r>
+        <w:t xml:space="preserve">: компромисс (между качеством и эффективностью) (</w:t>
+      </w:r>
+      <w:r>
+        <w:rPr>
+          <w:iCs/>
+          <w:i/>
+        </w:rPr>
+        <w:t xml:space="preserve">“</w:t>
+      </w:r>
+      <w:r>
+        <w:rPr>
+          <w:iCs/>
+          <w:i/>
+        </w:rPr>
+        <w:t xml:space="preserve">both the task performance and efficiency along with their trade-offs</w:t>
+      </w:r>
+      <w:r>
+        <w:rPr>
+          <w:iCs/>
+          <w:i/>
+        </w:rPr>
+        <w:t xml:space="preserve">”</w:t>
+      </w:r>
+      <w:r>
+        <w:t xml:space="preserve">).</w:t>
+      </w:r>
+    </w:p>
+    <w:p>
+      <w:pPr>
+        <w:numPr>
+          <w:ilvl w:val="0"/>
+          <w:numId w:val="1002"/>
+        </w:numPr>
+        <w:pStyle w:val="Compact"/>
+      </w:pPr>
+      <w:r>
+        <w:rPr>
+          <w:bCs/>
+          <w:b/>
+        </w:rPr>
+        <w:t xml:space="preserve">Upper bound</w:t>
+      </w:r>
+      <w:r>
+        <w:t xml:space="preserve">: верхняя граница (</w:t>
+      </w:r>
+      <w:r>
+        <w:rPr>
+          <w:iCs/>
+          <w:i/>
+        </w:rPr>
+        <w:t xml:space="preserve">“</w:t>
+      </w:r>
+      <w:r>
+        <w:rPr>
+          <w:iCs/>
+          <w:i/>
+        </w:rPr>
+        <w:t xml:space="preserve">to see the upper bound of our Adaptive-RAG</w:t>
+      </w:r>
+      <w:r>
+        <w:rPr>
+          <w:iCs/>
+          <w:i/>
+        </w:rPr>
+        <w:t xml:space="preserve">”</w:t>
+      </w:r>
+      <w:r>
+        <w:t xml:space="preserve">).</w:t>
+      </w:r>
+    </w:p>
+    <w:p>
+      <w:pPr>
+        <w:numPr>
+          <w:ilvl w:val="0"/>
+          <w:numId w:val="1002"/>
+        </w:numPr>
+        <w:pStyle w:val="Compact"/>
+      </w:pPr>
+      <w:r>
+        <w:rPr>
+          <w:bCs/>
+          <w:b/>
+        </w:rPr>
+        <w:t xml:space="preserve">Confusion matrix</w:t>
+      </w:r>
+      <w:r>
+        <w:t xml:space="preserve">: матрица ошибок (</w:t>
+      </w:r>
+      <w:r>
+        <w:rPr>
+          <w:iCs/>
+          <w:i/>
+        </w:rPr>
+        <w:t xml:space="preserve">“</w:t>
+      </w:r>
+      <w:r>
+        <w:rPr>
+          <w:iCs/>
+          <w:i/>
+        </w:rPr>
+        <w:t xml:space="preserve">we further report its confusion matrix</w:t>
+      </w:r>
+      <w:r>
+        <w:rPr>
+          <w:iCs/>
+          <w:i/>
+        </w:rPr>
+        <w:t xml:space="preserve">”</w:t>
+      </w:r>
+      <w:r>
+        <w:t xml:space="preserve">).</w:t>
+      </w:r>
+    </w:p>
+    <w:p>
+      <w:pPr>
+        <w:numPr>
+          <w:ilvl w:val="0"/>
+          <w:numId w:val="1002"/>
+        </w:numPr>
+        <w:pStyle w:val="Compact"/>
+      </w:pPr>
+      <w:r>
+        <w:rPr>
+          <w:bCs/>
+          <w:b/>
+        </w:rPr>
+        <w:t xml:space="preserve">Silver data</w:t>
+      </w:r>
+      <w:r>
+        <w:t xml:space="preserve">: «серебряные» данные, т. е. данные с автоматически полученной разметкой (</w:t>
+      </w:r>
+      <w:r>
+        <w:rPr>
+          <w:iCs/>
+          <w:i/>
+        </w:rPr>
+        <w:t xml:space="preserve">“</w:t>
+      </w:r>
+      <w:r>
+        <w:rPr>
+          <w:iCs/>
+          <w:i/>
+        </w:rPr>
+        <w:t xml:space="preserve">generating silver data from predicted outcomes of models</w:t>
+      </w:r>
+      <w:r>
+        <w:rPr>
+          <w:iCs/>
+          <w:i/>
+        </w:rPr>
+        <w:t xml:space="preserve">”</w:t>
+      </w:r>
+      <w:r>
+        <w:t xml:space="preserve">).</w:t>
+      </w:r>
+    </w:p>
+    <w:p>
+      <w:pPr>
+        <w:numPr>
+          <w:ilvl w:val="0"/>
+          <w:numId w:val="1002"/>
+        </w:numPr>
+        <w:pStyle w:val="Compact"/>
+      </w:pPr>
+      <w:r>
+        <w:rPr>
+          <w:bCs/>
+          <w:b/>
+        </w:rPr>
+        <w:t xml:space="preserve">Scalability</w:t>
+      </w:r>
+      <w:r>
+        <w:t xml:space="preserve">: масштабируемость (</w:t>
+      </w:r>
+      <w:r>
+        <w:rPr>
+          <w:iCs/>
+          <w:i/>
+        </w:rPr>
+        <w:t xml:space="preserve">“</w:t>
+      </w:r>
+      <w:r>
+        <w:rPr>
+          <w:iCs/>
+          <w:i/>
+        </w:rPr>
+        <w:t xml:space="preserve">a critical factor for practical applications and scalability</w:t>
+      </w:r>
+      <w:r>
+        <w:rPr>
+          <w:iCs/>
+          <w:i/>
+        </w:rPr>
+        <w:t xml:space="preserve">”</w:t>
+      </w:r>
+      <w:r>
+        <w:t xml:space="preserve">).</w:t>
+      </w:r>
+    </w:p>
+    <w:bookmarkEnd w:id="35"/>
     <w:sectPr/>
   </w:body>
 </w:document>
@@ -11676,11 +13191,126 @@
       </w:pPr>
     </w:lvl>
   </w:abstractNum>
+  <w:abstractNum w:abstractNumId="99411">
+    <w:nsid w:val="A99411"/>
+    <w:multiLevelType w:val="multilevel"/>
+    <w:lvl w:ilvl="0">
+      <w:start w:val="1"/>
+      <w:numFmt w:val="decimal"/>
+      <w:lvlText w:val="%1."/>
+      <w:lvlJc w:val="left"/>
+      <w:pPr>
+        <w:ind w:left="720" w:hanging="480"/>
+      </w:pPr>
+    </w:lvl>
+    <w:lvl w:ilvl="1">
+      <w:start w:val="1"/>
+      <w:numFmt w:val="decimal"/>
+      <w:lvlText w:val="%2."/>
+      <w:lvlJc w:val="left"/>
+      <w:pPr>
+        <w:ind w:left="1440" w:hanging="480"/>
+      </w:pPr>
+    </w:lvl>
+    <w:lvl w:ilvl="2">
+      <w:start w:val="1"/>
+      <w:numFmt w:val="decimal"/>
+      <w:lvlText w:val="%3."/>
+      <w:lvlJc w:val="left"/>
+      <w:pPr>
+        <w:ind w:left="2160" w:hanging="480"/>
+      </w:pPr>
+    </w:lvl>
+    <w:lvl w:ilvl="3">
+      <w:start w:val="1"/>
+      <w:numFmt w:val="decimal"/>
+      <w:lvlText w:val="%4."/>
+      <w:lvlJc w:val="left"/>
+      <w:pPr>
+        <w:ind w:left="2880" w:hanging="480"/>
+      </w:pPr>
+    </w:lvl>
+    <w:lvl w:ilvl="4">
+      <w:start w:val="1"/>
+      <w:numFmt w:val="decimal"/>
+      <w:lvlText w:val="%5."/>
+      <w:lvlJc w:val="left"/>
+      <w:pPr>
+        <w:ind w:left="3600" w:hanging="480"/>
+      </w:pPr>
+    </w:lvl>
+    <w:lvl w:ilvl="5">
+      <w:start w:val="1"/>
+      <w:numFmt w:val="decimal"/>
+      <w:lvlText w:val="%6."/>
+      <w:lvlJc w:val="left"/>
+      <w:pPr>
+        <w:ind w:left="4320" w:hanging="480"/>
+      </w:pPr>
+    </w:lvl>
+    <w:lvl w:ilvl="6">
+      <w:start w:val="1"/>
+      <w:numFmt w:val="decimal"/>
+      <w:lvlText w:val="%7."/>
+      <w:lvlJc w:val="left"/>
+      <w:pPr>
+        <w:ind w:left="5040" w:hanging="480"/>
+      </w:pPr>
+    </w:lvl>
+    <w:lvl w:ilvl="7">
+      <w:start w:val="1"/>
+      <w:numFmt w:val="decimal"/>
+      <w:lvlText w:val="%8."/>
+      <w:lvlJc w:val="left"/>
+      <w:pPr>
+        <w:ind w:left="5760" w:hanging="480"/>
+      </w:pPr>
+    </w:lvl>
+    <w:lvl w:ilvl="8">
+      <w:start w:val="1"/>
+      <w:numFmt w:val="decimal"/>
+      <w:lvlText w:val="%9."/>
+      <w:lvlJc w:val="left"/>
+      <w:pPr>
+        <w:ind w:left="6480" w:hanging="480"/>
+      </w:pPr>
+    </w:lvl>
+  </w:abstractNum>
   <w:num w:numId="1000">
     <w:abstractNumId w:val="990"/>
   </w:num>
   <w:num w:numId="1001">
     <w:abstractNumId w:val="991"/>
+  </w:num>
+  <w:num w:numId="1002">
+    <w:abstractNumId w:val="99411"/>
+    <w:lvlOverride w:ilvl="0">
+      <w:startOverride w:val="1"/>
+    </w:lvlOverride>
+    <w:lvlOverride w:ilvl="1">
+      <w:startOverride w:val="1"/>
+    </w:lvlOverride>
+    <w:lvlOverride w:ilvl="2">
+      <w:startOverride w:val="1"/>
+    </w:lvlOverride>
+    <w:lvlOverride w:ilvl="3">
+      <w:startOverride w:val="1"/>
+    </w:lvlOverride>
+    <w:lvlOverride w:ilvl="4">
+      <w:startOverride w:val="1"/>
+    </w:lvlOverride>
+    <w:lvlOverride w:ilvl="5">
+      <w:startOverride w:val="1"/>
+    </w:lvlOverride>
+    <w:lvlOverride w:ilvl="6">
+      <w:startOverride w:val="1"/>
+    </w:lvlOverride>
+    <w:lvlOverride w:ilvl="7">
+      <w:startOverride w:val="1"/>
+    </w:lvlOverride>
+    <w:lvlOverride w:ilvl="8">
+      <w:startOverride w:val="1"/>
+    </w:lvlOverride>
   </w:num>
 </w:numbering>
 </file>

</xml_diff>

<commit_message>
Add TASK 1 for Англ2 (Adaptive-RAG)
- Step 1: publication details checked against the ACL Anthology record
  (NAACL 2024 proceedings, Volume 1: Long Papers, pp. 7036-7050).
- Step 2: genre (research article, NAACL long paper), audience and the
  three questions on the title.
- Step 3 a-e: background and aim, methods, findings with figures from
  Tables 1-4 and 6, meaning and limitations, and the 45 references
  grouped by their role in the paper.
- Every number and citation was checked against the original; the
  avoid-ai-writing detector reports only the bold field labels of the
  template. DOCX rebuilt; README, AGENTS.md and CLAUDE.md updated.

Co-Authored-By: Claude Opus 5.5 <noreply@anthropic.com>
Claude-Session: https://claude.ai/code/session_012rcQ2jGicmEaWTkWtfTEb2
</commit_message>
<xml_diff>
--- a/ДолжиковДП_Англ2.docx
+++ b/ДолжиковДП_Англ2.docx
@@ -12907,6 +12907,712 @@
       </w:r>
     </w:p>
     <w:bookmarkEnd w:id="35"/>
+    <w:bookmarkStart w:id="47" w:name="task-1"/>
+    <w:p>
+      <w:pPr>
+        <w:pStyle w:val="Heading3"/>
+      </w:pPr>
+      <w:r>
+        <w:t xml:space="preserve">TASK 1</w:t>
+      </w:r>
+    </w:p>
+    <w:bookmarkStart w:id="36" w:name="Xe81edb86be9c2021b71df62ed49ffe101b9b26a"/>
+    <w:p>
+      <w:pPr>
+        <w:pStyle w:val="Heading4"/>
+      </w:pPr>
+      <w:r>
+        <w:t xml:space="preserve">Step 1: Navigating and positioning a text using publication details</w:t>
+      </w:r>
+    </w:p>
+    <w:p>
+      <w:pPr>
+        <w:numPr>
+          <w:ilvl w:val="0"/>
+          <w:numId w:val="1003"/>
+        </w:numPr>
+        <w:pStyle w:val="Compact"/>
+      </w:pPr>
+      <w:r>
+        <w:rPr>
+          <w:bCs/>
+          <w:b/>
+        </w:rPr>
+        <w:t xml:space="preserve">Name of the journal</w:t>
+      </w:r>
+      <w:r>
+        <w:t xml:space="preserve">: the article is a conference paper, so it was published in conference proceedings rather than in a journal:</w:t>
+      </w:r>
+      <w:r>
+        <w:t xml:space="preserve"> </w:t>
+      </w:r>
+      <w:r>
+        <w:rPr>
+          <w:iCs/>
+          <w:i/>
+        </w:rPr>
+        <w:t xml:space="preserve">Proceedings of the 2024 Conference of the North American Chapter of the Association for Computational Linguistics: Human Language Technologies (NAACL 2024)</w:t>
+      </w:r>
+      <w:r>
+        <w:t xml:space="preserve">, Association for Computational Linguistics, Mexico City, Mexico. The translation follows the arXiv preprint arXiv:2403.14403v2.</w:t>
+      </w:r>
+    </w:p>
+    <w:p>
+      <w:pPr>
+        <w:numPr>
+          <w:ilvl w:val="0"/>
+          <w:numId w:val="1003"/>
+        </w:numPr>
+        <w:pStyle w:val="Compact"/>
+      </w:pPr>
+      <w:r>
+        <w:rPr>
+          <w:bCs/>
+          <w:b/>
+        </w:rPr>
+        <w:t xml:space="preserve">The volume number of the journal</w:t>
+      </w:r>
+      <w:r>
+        <w:t xml:space="preserve">: Volume 1 (Long Papers).</w:t>
+      </w:r>
+    </w:p>
+    <w:p>
+      <w:pPr>
+        <w:numPr>
+          <w:ilvl w:val="0"/>
+          <w:numId w:val="1003"/>
+        </w:numPr>
+        <w:pStyle w:val="Compact"/>
+      </w:pPr>
+      <w:r>
+        <w:rPr>
+          <w:bCs/>
+          <w:b/>
+        </w:rPr>
+        <w:t xml:space="preserve">The issue number of the volume</w:t>
+      </w:r>
+      <w:r>
+        <w:t xml:space="preserve">: not applicable, as conference proceedings are not divided into issues.</w:t>
+      </w:r>
+    </w:p>
+    <w:p>
+      <w:pPr>
+        <w:numPr>
+          <w:ilvl w:val="0"/>
+          <w:numId w:val="1003"/>
+        </w:numPr>
+        <w:pStyle w:val="Compact"/>
+      </w:pPr>
+      <w:r>
+        <w:rPr>
+          <w:bCs/>
+          <w:b/>
+        </w:rPr>
+        <w:t xml:space="preserve">The year of publication</w:t>
+      </w:r>
+      <w:r>
+        <w:t xml:space="preserve">: 2024.</w:t>
+      </w:r>
+    </w:p>
+    <w:p>
+      <w:pPr>
+        <w:numPr>
+          <w:ilvl w:val="0"/>
+          <w:numId w:val="1003"/>
+        </w:numPr>
+        <w:pStyle w:val="Compact"/>
+      </w:pPr>
+      <w:r>
+        <w:rPr>
+          <w:bCs/>
+          <w:b/>
+        </w:rPr>
+        <w:t xml:space="preserve">The first and the last page numbers of the article</w:t>
+      </w:r>
+      <w:r>
+        <w:t xml:space="preserve">: 7036–7050.</w:t>
+      </w:r>
+    </w:p>
+    <w:p>
+      <w:pPr>
+        <w:numPr>
+          <w:ilvl w:val="0"/>
+          <w:numId w:val="1003"/>
+        </w:numPr>
+        <w:pStyle w:val="Compact"/>
+      </w:pPr>
+      <w:r>
+        <w:rPr>
+          <w:bCs/>
+          <w:b/>
+        </w:rPr>
+        <w:t xml:space="preserve">The title of the article</w:t>
+      </w:r>
+      <w:r>
+        <w:t xml:space="preserve">: Adaptive-RAG: Learning to Adapt Retrieval-Augmented Large Language Models through Question Complexity.</w:t>
+      </w:r>
+    </w:p>
+    <w:p>
+      <w:pPr>
+        <w:numPr>
+          <w:ilvl w:val="0"/>
+          <w:numId w:val="1003"/>
+        </w:numPr>
+        <w:pStyle w:val="Compact"/>
+      </w:pPr>
+      <w:r>
+        <w:rPr>
+          <w:bCs/>
+          <w:b/>
+        </w:rPr>
+        <w:t xml:space="preserve">The names (surnames and initials) of the authors</w:t>
+      </w:r>
+      <w:r>
+        <w:t xml:space="preserve">: Jeong, S., Baek, J., Cho, S., Hwang, S. J., and Park, J. C.</w:t>
+      </w:r>
+    </w:p>
+    <w:bookmarkEnd w:id="36"/>
+    <w:bookmarkStart w:id="40" w:name="step-2-genre-audience-and-purpose"/>
+    <w:p>
+      <w:pPr>
+        <w:pStyle w:val="Heading4"/>
+      </w:pPr>
+      <w:r>
+        <w:t xml:space="preserve">Step 2: Genre, audience, and purpose</w:t>
+      </w:r>
+    </w:p>
+    <w:bookmarkStart w:id="37" w:name="what-type-of-article-is-this"/>
+    <w:p>
+      <w:pPr>
+        <w:pStyle w:val="Heading5"/>
+      </w:pPr>
+      <w:r>
+        <w:t xml:space="preserve">1. What type of article is this?</w:t>
+      </w:r>
+    </w:p>
+    <w:p>
+      <w:pPr>
+        <w:numPr>
+          <w:ilvl w:val="0"/>
+          <w:numId w:val="1004"/>
+        </w:numPr>
+        <w:pStyle w:val="Compact"/>
+      </w:pPr>
+      <w:r>
+        <w:t xml:space="preserve">It is a research article. The authors propose a new method, the Adaptive-RAG framework, test it on six question-answering datasets with three language models, and report quantitative results in tables and figures. The structure is close to IMRaD: Introduction, Related Work, Method, Experimental Setups (the methods part), Experimental Results and Analyses, and Conclusion with a Limitations section.</w:t>
+      </w:r>
+    </w:p>
+    <w:p>
+      <w:pPr>
+        <w:numPr>
+          <w:ilvl w:val="0"/>
+          <w:numId w:val="1004"/>
+        </w:numPr>
+        <w:pStyle w:val="Compact"/>
+      </w:pPr>
+      <w:r>
+        <w:t xml:space="preserve">It is a long paper of NAACL 2024, a peer-reviewed international conference. In natural language processing, such papers are the usual format for publishing original research.</w:t>
+      </w:r>
+    </w:p>
+    <w:bookmarkEnd w:id="37"/>
+    <w:bookmarkStart w:id="38" w:name="who-do-you-think-it-is-written-for"/>
+    <w:p>
+      <w:pPr>
+        <w:pStyle w:val="Heading5"/>
+      </w:pPr>
+      <w:r>
+        <w:t xml:space="preserve">2. Who do you think it is written for?</w:t>
+      </w:r>
+    </w:p>
+    <w:p>
+      <w:pPr>
+        <w:numPr>
+          <w:ilvl w:val="0"/>
+          <w:numId w:val="1005"/>
+        </w:numPr>
+        <w:pStyle w:val="Compact"/>
+      </w:pPr>
+      <w:r>
+        <w:t xml:space="preserve">Researchers, lecturers and professors working in natural language processing, information retrieval and machine learning, and graduate students (Master’s and PhD level) who study large language models and question-answering systems.</w:t>
+      </w:r>
+    </w:p>
+    <w:p>
+      <w:pPr>
+        <w:numPr>
+          <w:ilvl w:val="0"/>
+          <w:numId w:val="1005"/>
+        </w:numPr>
+        <w:pStyle w:val="Compact"/>
+      </w:pPr>
+      <w:r>
+        <w:t xml:space="preserve">Experts rather than novices. The authors expect the reader to know how retrieval-augmented generation works, what single-hop and multi-hop question answering is, and how EM, F1 and accuracy are calculated. Terms such as BM25, FLAN-T5 and Chain-of-Thought reasoning appear without explanation.</w:t>
+      </w:r>
+    </w:p>
+    <w:p>
+      <w:pPr>
+        <w:numPr>
+          <w:ilvl w:val="0"/>
+          <w:numId w:val="1005"/>
+        </w:numPr>
+        <w:pStyle w:val="Compact"/>
+      </w:pPr>
+      <w:r>
+        <w:t xml:space="preserve">An international audience. The paper is written in English, was presented at an international conference and uses widely known international benchmark datasets.</w:t>
+      </w:r>
+    </w:p>
+    <w:bookmarkEnd w:id="38"/>
+    <w:bookmarkStart w:id="39" w:name="questions-based-on-the-title"/>
+    <w:p>
+      <w:pPr>
+        <w:pStyle w:val="Heading5"/>
+      </w:pPr>
+      <w:r>
+        <w:t xml:space="preserve">3. Questions based on the title:</w:t>
+      </w:r>
+    </w:p>
+    <w:p>
+      <w:pPr>
+        <w:numPr>
+          <w:ilvl w:val="0"/>
+          <w:numId w:val="1006"/>
+        </w:numPr>
+        <w:pStyle w:val="Compact"/>
+      </w:pPr>
+      <w:r>
+        <w:rPr>
+          <w:bCs/>
+          <w:b/>
+        </w:rPr>
+        <w:t xml:space="preserve">Why has the article been written?</w:t>
+      </w:r>
+      <w:r>
+        <w:t xml:space="preserve"> </w:t>
+      </w:r>
+      <w:r>
+        <w:t xml:space="preserve">Retrieval-augmented language models usually apply one fixed strategy to every question. As a result, simple questions cost too much time and computation, while complex multi-hop questions get too little retrieval and are often answered incorrectly. The authors wrote the article to show that a system can choose its strategy according to the complexity of each question.</w:t>
+      </w:r>
+    </w:p>
+    <w:p>
+      <w:pPr>
+        <w:numPr>
+          <w:ilvl w:val="0"/>
+          <w:numId w:val="1006"/>
+        </w:numPr>
+        <w:pStyle w:val="Compact"/>
+      </w:pPr>
+      <w:r>
+        <w:rPr>
+          <w:bCs/>
+          <w:b/>
+        </w:rPr>
+        <w:t xml:space="preserve">What is the object of the article?</w:t>
+      </w:r>
+      <w:r>
+        <w:t xml:space="preserve"> </w:t>
+      </w:r>
+      <w:r>
+        <w:t xml:space="preserve">Retrieval-augmented large language models in open-domain question answering: three ways of using them (answering without retrieval, single-step retrieval and multi-step retrieval) and the complexity of the questions they receive.</w:t>
+      </w:r>
+    </w:p>
+    <w:p>
+      <w:pPr>
+        <w:numPr>
+          <w:ilvl w:val="0"/>
+          <w:numId w:val="1006"/>
+        </w:numPr>
+        <w:pStyle w:val="Compact"/>
+      </w:pPr>
+      <w:r>
+        <w:rPr>
+          <w:bCs/>
+          <w:b/>
+        </w:rPr>
+        <w:t xml:space="preserve">What does the article review / investigate?</w:t>
+      </w:r>
+      <w:r>
+        <w:t xml:space="preserve"> </w:t>
+      </w:r>
+      <w:r>
+        <w:t xml:space="preserve">It investigates whether a small classifier that predicts the complexity of an incoming question (label A, B or C) and sends the question to the matching strategy gives a better balance between answer accuracy and computational cost than existing fixed and adaptive approaches.</w:t>
+      </w:r>
+    </w:p>
+    <w:bookmarkEnd w:id="39"/>
+    <w:bookmarkEnd w:id="40"/>
+    <w:bookmarkStart w:id="46" w:name="X79f5a4cca2cb4d984973f0c81078f16277b1deb"/>
+    <w:p>
+      <w:pPr>
+        <w:pStyle w:val="Heading4"/>
+      </w:pPr>
+      <w:r>
+        <w:t xml:space="preserve">Step 3: Study the whole text and answer the questions</w:t>
+      </w:r>
+    </w:p>
+    <w:bookmarkStart w:id="41" w:name="X4fbea2b68830a47efeb7ba510c02d1f3cb8d4cb"/>
+    <w:p>
+      <w:pPr>
+        <w:pStyle w:val="Heading5"/>
+      </w:pPr>
+      <w:r>
+        <w:t xml:space="preserve">a. What is the background and aim of the investigation?</w:t>
+      </w:r>
+    </w:p>
+    <w:p>
+      <w:pPr>
+        <w:numPr>
+          <w:ilvl w:val="0"/>
+          <w:numId w:val="1007"/>
+        </w:numPr>
+        <w:pStyle w:val="Compact"/>
+      </w:pPr>
+      <w:r>
+        <w:rPr>
+          <w:bCs/>
+          <w:b/>
+        </w:rPr>
+        <w:t xml:space="preserve">Background</w:t>
+      </w:r>
+      <w:r>
+        <w:t xml:space="preserve">: Large language models answer many questions well, but their knowledge is stored only in their parameters, so they make factual errors and cannot keep up with changing information. Retrieval-augmented models address this by adding documents from an external knowledge source, such as Wikipedia, to the model input. Single-step retrieval works for single-hop questions, whose answer is found in one document. Multi-hop questions need several rounds of retrieval and reasoning; multi-step methods handle them better, but they are slow and expensive. The authors argue that real users often ask simple questions and only sometimes complex ones. Existing adaptive methods either decide only whether to retrieve or not (Mallen et al., 2023) or rely on a single trained model (Asai et al., 2024), so they are too simple or too heavy for many queries.</w:t>
+      </w:r>
+    </w:p>
+    <w:p>
+      <w:pPr>
+        <w:numPr>
+          <w:ilvl w:val="0"/>
+          <w:numId w:val="1007"/>
+        </w:numPr>
+        <w:pStyle w:val="Compact"/>
+      </w:pPr>
+      <w:r>
+        <w:rPr>
+          <w:bCs/>
+          <w:b/>
+        </w:rPr>
+        <w:t xml:space="preserve">Aim</w:t>
+      </w:r>
+      <w:r>
+        <w:t xml:space="preserve">: To build a question-answering framework that first estimates the complexity of each query and then selects the most suitable strategy (no retrieval, single-step retrieval or multi-step retrieval), so that the system stays accurate on complex questions and spends fewer resources on simple ones.</w:t>
+      </w:r>
+    </w:p>
+    <w:bookmarkEnd w:id="41"/>
+    <w:bookmarkStart w:id="42" w:name="b.-what-was-done-in-the-investigation"/>
+    <w:p>
+      <w:pPr>
+        <w:pStyle w:val="Heading5"/>
+      </w:pPr>
+      <w:r>
+        <w:t xml:space="preserve">b. What was done in the investigation?</w:t>
+      </w:r>
+    </w:p>
+    <w:p>
+      <w:pPr>
+        <w:numPr>
+          <w:ilvl w:val="0"/>
+          <w:numId w:val="1008"/>
+        </w:numPr>
+        <w:pStyle w:val="Compact"/>
+      </w:pPr>
+      <w:r>
+        <w:t xml:space="preserve">The authors formalised three strategies for retrieval-augmented LLMs: answering with the LLM alone, single-step retrieval followed by generation, and multi-step retrieval in which the LLM and the retriever interact over several rounds (the method of Trivedi et al., 2023). All strategies used the same BM25 retriever.</w:t>
+      </w:r>
+    </w:p>
+    <w:p>
+      <w:pPr>
+        <w:numPr>
+          <w:ilvl w:val="0"/>
+          <w:numId w:val="1008"/>
+        </w:numPr>
+        <w:pStyle w:val="Compact"/>
+      </w:pPr>
+      <w:r>
+        <w:t xml:space="preserve">They trained a query-complexity classifier based on T5-Large (770M parameters) that gives each query one of three labels: A (no retrieval), B (single-step approach) or C (multi-step approach). As no labelled data existed, the training data were built automatically. A query received the label of the simplest strategy that answered it correctly; queries that no strategy answered correctly were labelled by dataset type, B for single-hop datasets and C for multi-hop datasets. The classifier was trained with a cross-entropy loss, the AdamW optimizer and a learning rate of 3e-5 on queries sampled from each dataset (400 per dataset), which did not overlap with the test queries.</w:t>
+      </w:r>
+    </w:p>
+    <w:p>
+      <w:pPr>
+        <w:numPr>
+          <w:ilvl w:val="0"/>
+          <w:numId w:val="1008"/>
+        </w:numPr>
+        <w:pStyle w:val="Compact"/>
+      </w:pPr>
+      <w:r>
+        <w:t xml:space="preserve">The framework was tested on six open-domain QA datasets: SQuAD v1.1, Natural Questions and TriviaQA (single-hop), and MuSiQue, HotpotQA and 2WikiMultiHopQA (multi-hop), with 500 test samples per dataset. Answers were generated by FLAN-T5-XL (3B parameters), FLAN-T5-XXL (11B parameters) and GPT-3.5 (gpt-3.5-turbo-instruct).</w:t>
+      </w:r>
+    </w:p>
+    <w:p>
+      <w:pPr>
+        <w:numPr>
+          <w:ilvl w:val="0"/>
+          <w:numId w:val="1008"/>
+        </w:numPr>
+        <w:pStyle w:val="Compact"/>
+      </w:pPr>
+      <w:r>
+        <w:t xml:space="preserve">Adaptive-RAG was compared with no retrieval, the single-step approach, Adaptive Retrieval (Mallen et al., 2023), Self-RAG (Asai et al., 2024) and the multi-step approach. Answer quality was measured with EM, F1 and accuracy, and efficiency with the number of retrieval-and-generation steps and the time per query relative to the single-step approach (which equals 1.00). The authors also evaluated an oracle version with a perfect classifier and analysed the classifier’s accuracy, its training data, its size and two example questions.</w:t>
+      </w:r>
+    </w:p>
+    <w:bookmarkEnd w:id="42"/>
+    <w:bookmarkStart w:id="43" w:name="c.-what-was-founddiscovered"/>
+    <w:p>
+      <w:pPr>
+        <w:pStyle w:val="Heading5"/>
+      </w:pPr>
+      <w:r>
+        <w:t xml:space="preserve">c. What was found/discovered?</w:t>
+      </w:r>
+    </w:p>
+    <w:p>
+      <w:pPr>
+        <w:numPr>
+          <w:ilvl w:val="0"/>
+          <w:numId w:val="1009"/>
+        </w:numPr>
+        <w:pStyle w:val="Compact"/>
+      </w:pPr>
+      <w:r>
+        <w:t xml:space="preserve">Averaged over the six datasets with GPT-3.5, Adaptive-RAG reached an F1 score of 50.91, on par with the multi-step approach (50.87), but it needed 1.03 retrieval steps instead of 2.81 and a relative time of 1.46 instead of 3.33. With FLAN-T5-XL, its F1 was 46.94 against 48.85 for the multi-step approach, while the relative time fell from 8.81 to 3.60.</w:t>
+      </w:r>
+    </w:p>
+    <w:p>
+      <w:pPr>
+        <w:numPr>
+          <w:ilvl w:val="0"/>
+          <w:numId w:val="1009"/>
+        </w:numPr>
+        <w:pStyle w:val="Compact"/>
+      </w:pPr>
+      <w:r>
+        <w:t xml:space="preserve">Among the adaptive methods, Adaptive-RAG gave the best answers. With FLAN-T5-XL its F1 was 46.94, compared with 32.24 for Adaptive Retrieval and 20.79 for Self-RAG (which uses its own LLaMA2 base model). The difference was largest on multi-hop data: on HotpotQA, for example, Adaptive-RAG scored 53.82 F1 against 32.22 for Adaptive Retrieval.</w:t>
+      </w:r>
+    </w:p>
+    <w:p>
+      <w:pPr>
+        <w:numPr>
+          <w:ilvl w:val="0"/>
+          <w:numId w:val="1009"/>
+        </w:numPr>
+        <w:pStyle w:val="Compact"/>
+      </w:pPr>
+      <w:r>
+        <w:t xml:space="preserve">With an oracle classifier, F1 rose to 56.28 with FLAN-T5-XL and to 62.80 with GPT-3.5, and the system became even faster (relative time 2.11 and 1.03).</w:t>
+      </w:r>
+    </w:p>
+    <w:p>
+      <w:pPr>
+        <w:numPr>
+          <w:ilvl w:val="0"/>
+          <w:numId w:val="1009"/>
+        </w:numPr>
+        <w:pStyle w:val="Compact"/>
+      </w:pPr>
+      <w:r>
+        <w:t xml:space="preserve">The classifier labelled 54.52% of the queries correctly. It recognised queries of type B (66.28%) and C (65.45%) much better than queries of type A (30.52%); according to the confusion matrix, 47% of type A queries were sent to single-step retrieval.</w:t>
+      </w:r>
+    </w:p>
+    <w:p>
+      <w:pPr>
+        <w:numPr>
+          <w:ilvl w:val="0"/>
+          <w:numId w:val="1009"/>
+        </w:numPr>
+        <w:pStyle w:val="Compact"/>
+      </w:pPr>
+      <w:r>
+        <w:t xml:space="preserve">The average time per query was 0.35 s for label A, 3.08 s for label B and 27.18 s for label C, and the classifier assigned these labels to 8.60%, 53.33% and 38.07% of the queries.</w:t>
+      </w:r>
+    </w:p>
+    <w:p>
+      <w:pPr>
+        <w:numPr>
+          <w:ilvl w:val="0"/>
+          <w:numId w:val="1009"/>
+        </w:numPr>
+        <w:pStyle w:val="Compact"/>
+      </w:pPr>
+      <w:r>
+        <w:t xml:space="preserve">Both sources of automatic labels were useful. Without the silver data the system needed 1,464 steps instead of 1,084, and without the dataset-type labels its F1 dropped to 43.43. Smaller classifiers with 60M and 223M parameters reached almost the same F1 (45.83 and 45.97) as T5-Large (46.94).</w:t>
+      </w:r>
+    </w:p>
+    <w:bookmarkEnd w:id="43"/>
+    <w:bookmarkStart w:id="44" w:name="d.-what-do-the-results-mean"/>
+    <w:p>
+      <w:pPr>
+        <w:pStyle w:val="Heading5"/>
+      </w:pPr>
+      <w:r>
+        <w:t xml:space="preserve">d. What do the Results mean?</w:t>
+      </w:r>
+    </w:p>
+    <w:p>
+      <w:pPr>
+        <w:numPr>
+          <w:ilvl w:val="0"/>
+          <w:numId w:val="1010"/>
+        </w:numPr>
+        <w:pStyle w:val="Compact"/>
+      </w:pPr>
+      <w:r>
+        <w:t xml:space="preserve">Choosing a strategy for each query gives a better balance between accuracy and cost than any single fixed strategy. Adaptive-RAG keeps most of the accuracy of multi-step retrieval and matches it with GPT-3.5, while needing 41–53% of its time.</w:t>
+      </w:r>
+    </w:p>
+    <w:p>
+      <w:pPr>
+        <w:numPr>
+          <w:ilvl w:val="0"/>
+          <w:numId w:val="1010"/>
+        </w:numPr>
+        <w:pStyle w:val="Compact"/>
+      </w:pPr>
+      <w:r>
+        <w:t xml:space="preserve">A binary decision on whether to retrieve or not is not enough. Methods based on this decision lose much accuracy on multi-hop questions, which require several retrieval steps.</w:t>
+      </w:r>
+    </w:p>
+    <w:p>
+      <w:pPr>
+        <w:numPr>
+          <w:ilvl w:val="0"/>
+          <w:numId w:val="1010"/>
+        </w:numPr>
+        <w:pStyle w:val="Compact"/>
+      </w:pPr>
+      <w:r>
+        <w:t xml:space="preserve">The classifier is the main bottleneck. The gap between the real classifier and the oracle (46.94 against 56.28 F1 with FLAN-T5-XL) shows that better complexity prediction would improve both accuracy and speed. Questions that need no retrieval are the hardest to recognise.</w:t>
+      </w:r>
+    </w:p>
+    <w:p>
+      <w:pPr>
+        <w:numPr>
+          <w:ilvl w:val="0"/>
+          <w:numId w:val="1010"/>
+        </w:numPr>
+        <w:pStyle w:val="Compact"/>
+      </w:pPr>
+      <w:r>
+        <w:t xml:space="preserve">The authors name the limitations themselves: the automatic labels can be wrong, no human-annotated dataset of query complexity exists, and the classifier is the simplest possible design. Future work includes datasets annotated with query complexity, stronger classifiers, finer levels of complexity and methods for detecting offensive user inputs and retrieved documents.</w:t>
+      </w:r>
+    </w:p>
+    <w:p>
+      <w:pPr>
+        <w:numPr>
+          <w:ilvl w:val="0"/>
+          <w:numId w:val="1010"/>
+        </w:numPr>
+        <w:pStyle w:val="Compact"/>
+      </w:pPr>
+      <w:r>
+        <w:t xml:space="preserve">For practical systems, where every call to an LLM has a price, the results suggest sending simple questions to cheaper strategies and keeping multi-step retrieval for complex ones.</w:t>
+      </w:r>
+    </w:p>
+    <w:bookmarkEnd w:id="44"/>
+    <w:bookmarkStart w:id="45" w:name="Xd14cc04d4a10a6d38b1f0487a01ea52fd64645a"/>
+    <w:p>
+      <w:pPr>
+        <w:pStyle w:val="Heading5"/>
+      </w:pPr>
+      <w:r>
+        <w:t xml:space="preserve">e. What literature sources are referenced in the paper?</w:t>
+      </w:r>
+    </w:p>
+    <w:p>
+      <w:pPr>
+        <w:numPr>
+          <w:ilvl w:val="0"/>
+          <w:numId w:val="1011"/>
+        </w:numPr>
+        <w:pStyle w:val="Compact"/>
+      </w:pPr>
+      <w:r>
+        <w:t xml:space="preserve">The reference list contains 45 sources published between 1994 and 2024; 36 of them appeared in 2020–2024. Many are papers from NLP and machine learning conferences (ACL, EMNLP, NAACL, ICLR, NeurIPS) and arXiv preprints.</w:t>
+      </w:r>
+    </w:p>
+    <w:p>
+      <w:pPr>
+        <w:numPr>
+          <w:ilvl w:val="0"/>
+          <w:numId w:val="1011"/>
+        </w:numPr>
+        <w:pStyle w:val="Compact"/>
+      </w:pPr>
+      <w:r>
+        <w:t xml:space="preserve">Large language models that motivate the study: Brown et al. (2020), OpenAI (2023), Touvron et al. (2023) and Anil et al. (2023).</w:t>
+      </w:r>
+    </w:p>
+    <w:p>
+      <w:pPr>
+        <w:numPr>
+          <w:ilvl w:val="0"/>
+          <w:numId w:val="1011"/>
+        </w:numPr>
+        <w:pStyle w:val="Compact"/>
+      </w:pPr>
+      <w:r>
+        <w:t xml:space="preserve">Work on the limits of parametric knowledge and on retrieval-augmented models: Kasai et al. (2022), Mallen et al. (2023), Borgeaud et al. (2022), Izacard et al. (2023), Shi et al. (2023), Lazaridou et al. (2022) and Ram et al. (2023).</w:t>
+      </w:r>
+    </w:p>
+    <w:p>
+      <w:pPr>
+        <w:numPr>
+          <w:ilvl w:val="0"/>
+          <w:numId w:val="1011"/>
+        </w:numPr>
+        <w:pStyle w:val="Compact"/>
+      </w:pPr>
+      <w:r>
+        <w:t xml:space="preserve">Open-domain question answering with a retriever and a reader: Chen et al. (2017), Karpukhin et al. (2020), Xiong et al. (2021), Izacard and Grave (2021) and Cho et al. (2023).</w:t>
+      </w:r>
+    </w:p>
+    <w:p>
+      <w:pPr>
+        <w:numPr>
+          <w:ilvl w:val="0"/>
+          <w:numId w:val="1011"/>
+        </w:numPr>
+        <w:pStyle w:val="Compact"/>
+      </w:pPr>
+      <w:r>
+        <w:t xml:space="preserve">Multi-hop question answering and iterative retrieval with reasoning, which form the basis of the multi-step strategy: Khattab et al. (2022), Press et al. (2023), Khot et al. (2023), Yao et al. (2023), Trivedi et al. (2023), Jiang et al. (2023) and Wei et al. (2022b).</w:t>
+      </w:r>
+    </w:p>
+    <w:p>
+      <w:pPr>
+        <w:numPr>
+          <w:ilvl w:val="0"/>
+          <w:numId w:val="1011"/>
+        </w:numPr>
+        <w:pStyle w:val="Compact"/>
+      </w:pPr>
+      <w:r>
+        <w:t xml:space="preserve">Adaptive retrieval methods, two of which serve as direct baselines: Mallen et al. (2023), Qi et al. (2021) and Asai et al. (2024).</w:t>
+      </w:r>
+    </w:p>
+    <w:p>
+      <w:pPr>
+        <w:numPr>
+          <w:ilvl w:val="0"/>
+          <w:numId w:val="1011"/>
+        </w:numPr>
+        <w:pStyle w:val="Compact"/>
+      </w:pPr>
+      <w:r>
+        <w:t xml:space="preserve">Datasets, models and tools used in the experiments: SQuAD (Rajpurkar et al., 2016), Natural Questions (Kwiatkowski et al., 2019), TriviaQA (Joshi et al., 2017), MuSiQue (Trivedi et al., 2022a), HotpotQA (Yang et al., 2018), 2WikiMultiHopQA (Ho et al., 2020), FLAN-T5 (Chung et al., 2022), T5 (Raffel et al., 2020), BM25 (Robertson et al., 1994) and the AdamW optimizer (Loshchilov and Hutter, 2019).</w:t>
+      </w:r>
+    </w:p>
+    <w:p>
+      <w:pPr>
+        <w:numPr>
+          <w:ilvl w:val="0"/>
+          <w:numId w:val="1011"/>
+        </w:numPr>
+        <w:pStyle w:val="Compact"/>
+      </w:pPr>
+      <w:r>
+        <w:t xml:space="preserve">Together, these sources show that the problem is real, describe the single-step, multi-step and adaptive solutions that Adaptive-RAG combines and compares with, and provide the datasets, models and tools for the experiments.</w:t>
+      </w:r>
+    </w:p>
+    <w:bookmarkEnd w:id="45"/>
+    <w:bookmarkEnd w:id="46"/>
+    <w:bookmarkEnd w:id="47"/>
     <w:sectPr/>
   </w:body>
 </w:document>
@@ -13311,6 +14017,33 @@
     <w:lvlOverride w:ilvl="8">
       <w:startOverride w:val="1"/>
     </w:lvlOverride>
+  </w:num>
+  <w:num w:numId="1003">
+    <w:abstractNumId w:val="991"/>
+  </w:num>
+  <w:num w:numId="1004">
+    <w:abstractNumId w:val="991"/>
+  </w:num>
+  <w:num w:numId="1005">
+    <w:abstractNumId w:val="991"/>
+  </w:num>
+  <w:num w:numId="1006">
+    <w:abstractNumId w:val="991"/>
+  </w:num>
+  <w:num w:numId="1007">
+    <w:abstractNumId w:val="991"/>
+  </w:num>
+  <w:num w:numId="1008">
+    <w:abstractNumId w:val="991"/>
+  </w:num>
+  <w:num w:numId="1009">
+    <w:abstractNumId w:val="991"/>
+  </w:num>
+  <w:num w:numId="1010">
+    <w:abstractNumId w:val="991"/>
+  </w:num>
+  <w:num w:numId="1011">
+    <w:abstractNumId w:val="991"/>
   </w:num>
 </w:numbering>
 </file>

</xml_diff>

<commit_message>
Add TASK 2 (annotation) for Англ2 (Adaptive-RAG)
331 words in three paragraphs with all required clichés from the
methodology in the prescribed order. Figures quoted (F1 50.91 vs 50.87,
less than half the time, ~55% classifier accuracy) come from Tables 1
and 4. The avoid-ai-writing detector flags only the mandatory
"In conclusion". DOCX rebuilt; README, AGENTS.md and CLAUDE.md updated.

Co-Authored-By: Claude Opus 5.5 <noreply@anthropic.com>
Claude-Session: https://claude.ai/code/session_012rcQ2jGicmEaWTkWtfTEb2
</commit_message>
<xml_diff>
--- a/ДолжиковДП_Англ2.docx
+++ b/ДолжиковДП_Англ2.docx
@@ -13613,6 +13613,125 @@
     <w:bookmarkEnd w:id="45"/>
     <w:bookmarkEnd w:id="46"/>
     <w:bookmarkEnd w:id="47"/>
+    <w:bookmarkStart w:id="48" w:name="task-2-annotation"/>
+    <w:p>
+      <w:pPr>
+        <w:pStyle w:val="Heading3"/>
+      </w:pPr>
+      <w:r>
+        <w:t xml:space="preserve">TASK 2: Annotation</w:t>
+      </w:r>
+    </w:p>
+    <w:p>
+      <w:pPr>
+        <w:pStyle w:val="FirstParagraph"/>
+      </w:pPr>
+      <w:r>
+        <w:rPr>
+          <w:bCs/>
+          <w:b/>
+        </w:rPr>
+        <w:t xml:space="preserve">Title:</w:t>
+      </w:r>
+      <w:r>
+        <w:t xml:space="preserve"> </w:t>
+      </w:r>
+      <w:r>
+        <w:t xml:space="preserve">Annotation of the research article</w:t>
+      </w:r>
+      <w:r>
+        <w:t xml:space="preserve"> </w:t>
+      </w:r>
+      <w:r>
+        <w:rPr>
+          <w:iCs/>
+          <w:i/>
+        </w:rPr>
+        <w:t xml:space="preserve">“</w:t>
+      </w:r>
+      <w:r>
+        <w:rPr>
+          <w:iCs/>
+          <w:i/>
+        </w:rPr>
+        <w:t xml:space="preserve">Adaptive-RAG: Learning to Adapt Retrieval-Augmented Large Language Models through Question Complexity</w:t>
+      </w:r>
+      <w:r>
+        <w:rPr>
+          <w:iCs/>
+          <w:i/>
+        </w:rPr>
+        <w:t xml:space="preserve">”</w:t>
+      </w:r>
+    </w:p>
+    <w:p>
+      <w:pPr>
+        <w:pStyle w:val="BodyText"/>
+      </w:pPr>
+      <w:r>
+        <w:t xml:space="preserve">The article I’m going to give a review of is taken from the</w:t>
+      </w:r>
+      <w:r>
+        <w:t xml:space="preserve"> </w:t>
+      </w:r>
+      <w:r>
+        <w:rPr>
+          <w:iCs/>
+          <w:i/>
+        </w:rPr>
+        <w:t xml:space="preserve">Proceedings of the 2024 Conference of the North American Chapter of the Association for Computational Linguistics: Human Language Technologies</w:t>
+      </w:r>
+      <w:r>
+        <w:t xml:space="preserve"> </w:t>
+      </w:r>
+      <w:r>
+        <w:t xml:space="preserve">(NAACL 2024, Volume 1: Long Papers, pp. 7036–7050). The headline of the article is</w:t>
+      </w:r>
+      <w:r>
+        <w:t xml:space="preserve"> </w:t>
+      </w:r>
+      <w:r>
+        <w:rPr>
+          <w:iCs/>
+          <w:i/>
+        </w:rPr>
+        <w:t xml:space="preserve">“</w:t>
+      </w:r>
+      <w:r>
+        <w:rPr>
+          <w:iCs/>
+          <w:i/>
+        </w:rPr>
+        <w:t xml:space="preserve">Adaptive-RAG: Learning to Adapt Retrieval-Augmented Large Language Models through Question Complexity</w:t>
+      </w:r>
+      <w:r>
+        <w:rPr>
+          <w:iCs/>
+          <w:i/>
+        </w:rPr>
+        <w:t xml:space="preserve">”</w:t>
+      </w:r>
+      <w:r>
+        <w:t xml:space="preserve">. It is written by S. Jeong, J. Baek, S. Cho, S. J. Hwang and J. C. Park.</w:t>
+      </w:r>
+    </w:p>
+    <w:p>
+      <w:pPr>
+        <w:pStyle w:val="BodyText"/>
+      </w:pPr>
+      <w:r>
+        <w:t xml:space="preserve">The topic of the article is retrieval-augmented question answering with large language models. The key issue of the article is how to choose a suitable retrieval strategy for each question. The article under discussion is devoted to the problem of queries of different complexity: multi-step retrieval wastes resources on simple questions, while single-step retrieval or no retrieval at all fails on complex ones. The article under discussion may be divided into several logically connected parts which are the introduction, related work, method, experiments with their analysis, and conclusion.</w:t>
+      </w:r>
+    </w:p>
+    <w:p>
+      <w:pPr>
+        <w:pStyle w:val="BodyText"/>
+      </w:pPr>
+      <w:r>
+        <w:t xml:space="preserve">The author starts by telling the reader that most retrieval-augmented systems apply one fixed strategy to all queries. At the beginning of the article the author describes three such strategies: answering without retrieval, single-step retrieval and multi-step retrieval. Then the author explains the Adaptive-RAG framework, in which a small T5-Large classifier gives each query a complexity label (A, B or C) and sends it to the matching strategy; its training labels are collected automatically. After that the author points out the results on six open-domain QA datasets: with GPT-3.5, Adaptive-RAG reaches an F1 score of 50.91, close to the 50.87 of the multi-step approach, in less than half of its time. The author also touches upon the classifier, which labels only about 55% of queries correctly. In conclusion the author makes it clear that adapting the strategy to query complexity improves both the accuracy and the efficiency of QA systems. The author concludes by saying that future work should create datasets annotated with query complexity and build better classifiers.</w:t>
+      </w:r>
+    </w:p>
+    <w:bookmarkEnd w:id="48"/>
     <w:sectPr/>
   </w:body>
 </w:document>

</xml_diff>